<commit_message>
docs: rewrite Document 1 with new structure
- New intro with softer 'Further follow-up visits were not feasible'
- Business Context section (brief, no exact product sizes)
- Problem Statement section (5 bullets)
- Proposed System Solution section (Dual-Phase)
- Stakeholder Analysis (renumbered)
- Elicitation Techniques (added Machinery observation)
- Challenges (updated 'Further follow-up visits were not feasible')
- Strategic Business Synthesis (renamed from Operational Deductions)
- Conclusion and Transition
- No document numbers in content, only titles
</commit_message>
<xml_diff>
--- a/project_deliverables/Phase1_Elicitation-and-Stakeholder-Analysis.docx
+++ b/project_deliverables/Phase1_Elicitation-and-Stakeholder-Analysis.docx
@@ -14,7 +14,7 @@
           <w:color w:val="000000"/>
           <w:sz w:val="24"/>
         </w:rPr>
-        <w:t>DOCUMENT 1: REQUIREMENTS ELICITATION AND STAKEHOLDER ANALYSIS</w:t>
+        <w:t>REQUIREMENTS ELICITATION AND STAKEHOLDER ANALYSIS</w:t>
       </w:r>
     </w:p>
     <w:p>
@@ -108,7 +108,7 @@
           <w:color w:val="000000"/>
           <w:sz w:val="24"/>
         </w:rPr>
-        <w:t>This document outlines the Requirements Elicitation and Stakeholder Analysis conducted for the Deniz Construction Management System (DCMS). It details the empirical data gathered during our single site visit, the challenges faced during data collection, and the current As Is operational reality of the business. Because follow up visits were not possible and the primary stakeholder was unwilling to provide further information, this document also establishes the baseline for how unresolvable information gaps are handled through documented business assumptions based on the Ugandan SME context.</w:t>
+        <w:t>This document outlines the Requirements Elicitation and Stakeholder Analysis conducted for the Deniz Construction Management System (DCMS). It details the data we gathered, the challenges faced during data collection, and the current operational reality of the business. Further follow up visits were not feasible and the Sales Manager was unwilling to provide further information. This document establishes the baseline for how unresolvable information gaps are handled through documented business assumptions based on the Ugandan SME context.</w:t>
       </w:r>
     </w:p>
     <w:p>
@@ -122,7 +122,7 @@
           <w:color w:val="000000"/>
           <w:sz w:val="24"/>
         </w:rPr>
-        <w:t>2. STAKEHOLDER ANALYSIS</w:t>
+        <w:t>2. BUSINESS CONTEXT</w:t>
       </w:r>
     </w:p>
     <w:p>
@@ -136,7 +136,7 @@
           <w:color w:val="000000"/>
           <w:sz w:val="24"/>
         </w:rPr>
-        <w:t>The organizational structure at the site is highly flattened. Roles are heavily concentrated, so the traditional corporate hierarchy does not apply. We mapped stakeholders on a Power and Interest grid to determine our engagement strategy and identify critical data gaps.</w:t>
+        <w:t>Deniz Construction Limited is a small construction materials business located on Ishanyu Bushenyi Road, Mbarara, Uganda. The business produces and sells concrete blocks, pavers, and kerbs. Operations are highly centralised: a single Sales Manager acts as supervisor, cashier, payroll distributor, record keeper, and tax filer. The Business Owner visits the site daily to review operations and cash. The business operates on a strict no credit policy with three payment channels: Cash, Mobile Money, and Bank Deposit. Physical receipts are printed on site for customers during truck loading. URA tax filing is done online. No cloud backup exists. Records are kept on a single laptop and in physical books. Workers are paid daily in cash without formal contracts.</w:t>
       </w:r>
     </w:p>
     <w:p>
@@ -150,7 +150,266 @@
           <w:color w:val="000000"/>
           <w:sz w:val="24"/>
         </w:rPr>
-        <w:t>2.1 Stakeholder Identification and Power Interest Mapping</w:t>
+        <w:t>3. PROBLEM STATEMENT</w:t>
+      </w:r>
+    </w:p>
+    <w:p>
+      <w:pPr>
+        <w:spacing w:lineRule="auto" w:line="276" w:before="0" w:after="120"/>
+      </w:pPr>
+      <w:r>
+        <w:rPr>
+          <w:rFonts w:ascii="Times New Roman" w:hAnsi="Times New Roman" w:cs="Times New Roman" w:eastAsia="Times New Roman"/>
+          <w:b w:val="0"/>
+          <w:color w:val="000000"/>
+          <w:sz w:val="24"/>
+        </w:rPr>
+        <w:t>The current operational model creates several critical vulnerabilities:</w:t>
+      </w:r>
+    </w:p>
+    <w:p>
+      <w:pPr>
+        <w:spacing w:lineRule="auto" w:line="276" w:before="0" w:after="60"/>
+      </w:pPr>
+      <w:r>
+        <w:rPr>
+          <w:rFonts w:ascii="Times New Roman" w:hAnsi="Times New Roman" w:cs="Times New Roman" w:eastAsia="Times New Roman"/>
+          <w:b w:val="0"/>
+          <w:color w:val="000000"/>
+          <w:sz w:val="24"/>
+        </w:rPr>
+        <w:t xml:space="preserve">•  </w:t>
+      </w:r>
+      <w:r>
+        <w:rPr>
+          <w:rFonts w:ascii="Times New Roman" w:hAnsi="Times New Roman" w:cs="Times New Roman" w:eastAsia="Times New Roman"/>
+          <w:b w:val="0"/>
+          <w:color w:val="000000"/>
+          <w:sz w:val="24"/>
+        </w:rPr>
+        <w:t>Super Manager Bottleneck: One person absorbs supervision, sales, payroll, record keeping, and tax filing a single point of failure.</w:t>
+      </w:r>
+    </w:p>
+    <w:p>
+      <w:pPr>
+        <w:spacing w:lineRule="auto" w:line="276" w:before="0" w:after="60"/>
+      </w:pPr>
+      <w:r>
+        <w:rPr>
+          <w:rFonts w:ascii="Times New Roman" w:hAnsi="Times New Roman" w:cs="Times New Roman" w:eastAsia="Times New Roman"/>
+          <w:b w:val="0"/>
+          <w:color w:val="000000"/>
+          <w:sz w:val="24"/>
+        </w:rPr>
+        <w:t xml:space="preserve">•  </w:t>
+      </w:r>
+      <w:r>
+        <w:rPr>
+          <w:rFonts w:ascii="Times New Roman" w:hAnsi="Times New Roman" w:cs="Times New Roman" w:eastAsia="Times New Roman"/>
+          <w:b w:val="0"/>
+          <w:color w:val="000000"/>
+          <w:sz w:val="24"/>
+        </w:rPr>
+        <w:t>Unexplained Cash Deficits: End of day cash shortages are manually computed without a tool to log operational expenses (e.g., loader lunch, transport), making variance causes opaque.</w:t>
+      </w:r>
+    </w:p>
+    <w:p>
+      <w:pPr>
+        <w:spacing w:lineRule="auto" w:line="276" w:before="0" w:after="60"/>
+      </w:pPr>
+      <w:r>
+        <w:rPr>
+          <w:rFonts w:ascii="Times New Roman" w:hAnsi="Times New Roman" w:cs="Times New Roman" w:eastAsia="Times New Roman"/>
+          <w:b w:val="0"/>
+          <w:color w:val="000000"/>
+          <w:sz w:val="24"/>
+        </w:rPr>
+        <w:t xml:space="preserve">•  </w:t>
+      </w:r>
+      <w:r>
+        <w:rPr>
+          <w:rFonts w:ascii="Times New Roman" w:hAnsi="Times New Roman" w:cs="Times New Roman" w:eastAsia="Times New Roman"/>
+          <w:b w:val="0"/>
+          <w:color w:val="000000"/>
+          <w:sz w:val="24"/>
+        </w:rPr>
+        <w:t>Informal Labour Practices: Attendance relies entirely on the Sales Manager memory. No formal attendance tracking exists, enabling ghost worker risk.</w:t>
+      </w:r>
+    </w:p>
+    <w:p>
+      <w:pPr>
+        <w:spacing w:lineRule="auto" w:line="276" w:before="0" w:after="60"/>
+      </w:pPr>
+      <w:r>
+        <w:rPr>
+          <w:rFonts w:ascii="Times New Roman" w:hAnsi="Times New Roman" w:cs="Times New Roman" w:eastAsia="Times New Roman"/>
+          <w:b w:val="0"/>
+          <w:color w:val="000000"/>
+          <w:sz w:val="24"/>
+        </w:rPr>
+        <w:t xml:space="preserve">•  </w:t>
+      </w:r>
+      <w:r>
+        <w:rPr>
+          <w:rFonts w:ascii="Times New Roman" w:hAnsi="Times New Roman" w:cs="Times New Roman" w:eastAsia="Times New Roman"/>
+          <w:b w:val="0"/>
+          <w:color w:val="000000"/>
+          <w:sz w:val="24"/>
+        </w:rPr>
+        <w:t>Data Vulnerability: All digital records reside on a single laptop with no cloud backup. Physical receipts and books provide limited redundancy.</w:t>
+      </w:r>
+    </w:p>
+    <w:p>
+      <w:pPr>
+        <w:spacing w:lineRule="auto" w:line="276" w:before="0" w:after="60"/>
+      </w:pPr>
+      <w:r>
+        <w:rPr>
+          <w:rFonts w:ascii="Times New Roman" w:hAnsi="Times New Roman" w:cs="Times New Roman" w:eastAsia="Times New Roman"/>
+          <w:b w:val="0"/>
+          <w:color w:val="000000"/>
+          <w:sz w:val="24"/>
+        </w:rPr>
+        <w:t xml:space="preserve">•  </w:t>
+      </w:r>
+      <w:r>
+        <w:rPr>
+          <w:rFonts w:ascii="Times New Roman" w:hAnsi="Times New Roman" w:cs="Times New Roman" w:eastAsia="Times New Roman"/>
+          <w:b w:val="0"/>
+          <w:color w:val="000000"/>
+          <w:sz w:val="24"/>
+        </w:rPr>
+        <w:t>Manual Reconciliation Burden: The Sales Manager uses the PC in the evening to process deficits and prepare summaries for the Owner a heavy, error prone manual workload.</w:t>
+      </w:r>
+    </w:p>
+    <w:p>
+      <w:pPr>
+        <w:spacing w:lineRule="auto" w:line="276" w:before="240" w:after="120"/>
+      </w:pPr>
+      <w:r>
+        <w:rPr>
+          <w:rFonts w:ascii="Times New Roman" w:hAnsi="Times New Roman" w:cs="Times New Roman" w:eastAsia="Times New Roman"/>
+          <w:b/>
+          <w:color w:val="000000"/>
+          <w:sz w:val="24"/>
+        </w:rPr>
+        <w:t>4. PROPOSED SYSTEM SOLUTION</w:t>
+      </w:r>
+    </w:p>
+    <w:p>
+      <w:pPr>
+        <w:spacing w:lineRule="auto" w:line="276" w:before="0" w:after="120"/>
+      </w:pPr>
+      <w:r>
+        <w:rPr>
+          <w:rFonts w:ascii="Times New Roman" w:hAnsi="Times New Roman" w:cs="Times New Roman" w:eastAsia="Times New Roman"/>
+          <w:b w:val="0"/>
+          <w:color w:val="000000"/>
+          <w:sz w:val="24"/>
+        </w:rPr>
+        <w:t>A Dual Phase Operations Management System:</w:t>
+      </w:r>
+    </w:p>
+    <w:p>
+      <w:pPr>
+        <w:spacing w:lineRule="auto" w:line="276" w:before="0" w:after="60"/>
+      </w:pPr>
+      <w:r>
+        <w:rPr>
+          <w:rFonts w:ascii="Times New Roman" w:hAnsi="Times New Roman" w:cs="Times New Roman" w:eastAsia="Times New Roman"/>
+          <w:b w:val="0"/>
+          <w:color w:val="000000"/>
+          <w:sz w:val="24"/>
+        </w:rPr>
+        <w:t xml:space="preserve">•  </w:t>
+      </w:r>
+      <w:r>
+        <w:rPr>
+          <w:rFonts w:ascii="Times New Roman" w:hAnsi="Times New Roman" w:cs="Times New Roman" w:eastAsia="Times New Roman"/>
+          <w:b w:val="0"/>
+          <w:color w:val="000000"/>
+          <w:sz w:val="24"/>
+        </w:rPr>
+        <w:t>Phase 1 (Day): Real Time Point of Sale processes individual sales, calculates VAT, updates inventory, prints physical receipts for customers as trucks load.</w:t>
+      </w:r>
+    </w:p>
+    <w:p>
+      <w:pPr>
+        <w:spacing w:lineRule="auto" w:line="276" w:before="0" w:after="60"/>
+      </w:pPr>
+      <w:r>
+        <w:rPr>
+          <w:rFonts w:ascii="Times New Roman" w:hAnsi="Times New Roman" w:cs="Times New Roman" w:eastAsia="Times New Roman"/>
+          <w:b w:val="0"/>
+          <w:color w:val="000000"/>
+          <w:sz w:val="24"/>
+        </w:rPr>
+        <w:t xml:space="preserve">•  </w:t>
+      </w:r>
+      <w:r>
+        <w:rPr>
+          <w:rFonts w:ascii="Times New Roman" w:hAnsi="Times New Roman" w:cs="Times New Roman" w:eastAsia="Times New Roman"/>
+          <w:b w:val="0"/>
+          <w:color w:val="000000"/>
+          <w:sz w:val="24"/>
+        </w:rPr>
+        <w:t>Phase 2 (Evening): End of Day Reconciliation Engine balances multi channel payment drawers (Cash, Mobile Money, Bank Deposit), logs operational expenses, computes cash variances (deficit/surplus), generates daily summary report for the Business Owner.</w:t>
+      </w:r>
+    </w:p>
+    <w:p>
+      <w:pPr>
+        <w:spacing w:lineRule="auto" w:line="276" w:before="0" w:after="120"/>
+      </w:pPr>
+      <w:r>
+        <w:rPr>
+          <w:rFonts w:ascii="Times New Roman" w:hAnsi="Times New Roman" w:cs="Times New Roman" w:eastAsia="Times New Roman"/>
+          <w:b w:val="0"/>
+          <w:color w:val="000000"/>
+          <w:sz w:val="24"/>
+        </w:rPr>
+        <w:t>The system runs on the existing laptop, operates offline first during the day, and performs an automated nightly cloud backup after evening reconciliation for disaster recovery.</w:t>
+      </w:r>
+    </w:p>
+    <w:p>
+      <w:pPr>
+        <w:spacing w:lineRule="auto" w:line="276" w:before="240" w:after="120"/>
+      </w:pPr>
+      <w:r>
+        <w:rPr>
+          <w:rFonts w:ascii="Times New Roman" w:hAnsi="Times New Roman" w:cs="Times New Roman" w:eastAsia="Times New Roman"/>
+          <w:b/>
+          <w:color w:val="000000"/>
+          <w:sz w:val="24"/>
+        </w:rPr>
+        <w:t>5. STAKEHOLDER ANALYSIS</w:t>
+      </w:r>
+    </w:p>
+    <w:p>
+      <w:pPr>
+        <w:spacing w:lineRule="auto" w:line="276" w:before="0" w:after="120"/>
+      </w:pPr>
+      <w:r>
+        <w:rPr>
+          <w:rFonts w:ascii="Times New Roman" w:hAnsi="Times New Roman" w:cs="Times New Roman" w:eastAsia="Times New Roman"/>
+          <w:b w:val="0"/>
+          <w:color w:val="000000"/>
+          <w:sz w:val="24"/>
+        </w:rPr>
+        <w:t>The organisational structure is highly flattened. Roles are heavily concentrated, so the traditional corporate hierarchy does not apply. We mapped stakeholders on a Power and Interest grid to determine engagement strategy and identify critical data gaps.</w:t>
+      </w:r>
+    </w:p>
+    <w:p>
+      <w:pPr>
+        <w:spacing w:lineRule="auto" w:line="276" w:before="240" w:after="120"/>
+      </w:pPr>
+      <w:r>
+        <w:rPr>
+          <w:rFonts w:ascii="Times New Roman" w:hAnsi="Times New Roman" w:cs="Times New Roman" w:eastAsia="Times New Roman"/>
+          <w:b/>
+          <w:color w:val="000000"/>
+          <w:sz w:val="24"/>
+        </w:rPr>
+        <w:t>5.1 Stakeholder Identification and Power Interest Mapping</w:t>
       </w:r>
     </w:p>
     <w:tbl>
@@ -366,7 +625,7 @@
                 <w:color w:val="000000"/>
                 <w:sz w:val="24"/>
               </w:rPr>
-              <w:t>Manage Closely. Status: Gap. Never interviewed. The system must eventually prioritize the metrics he reviews during his daily evening visits.</w:t>
+              <w:t>Manage Closely. Status: Gap. Never interviewed. The system must prioritise the metrics he reviews during his daily evening visits.</w:t>
             </w:r>
           </w:p>
         </w:tc>
@@ -408,7 +667,7 @@
                 <w:color w:val="000000"/>
                 <w:sz w:val="24"/>
               </w:rPr>
-              <w:t>The absolute center of operations. Acts as supervisor, cashier, payroll distributor, and record keeper.</w:t>
+              <w:t>The absolute centre of operations. Acts as supervisor, cashier, payroll distributor, and record keeper.</w:t>
             </w:r>
           </w:p>
         </w:tc>
@@ -876,7 +1135,7 @@
                 <w:color w:val="000000"/>
                 <w:sz w:val="24"/>
               </w:rPr>
-              <w:t>Keep Informed. The system must eventually ensure quick processing to minimize their loading delays.</w:t>
+              <w:t>Keep Informed. The system must ensure quick processing to minimise loading delays.</w:t>
             </w:r>
           </w:p>
         </w:tc>
@@ -899,7 +1158,7 @@
           <w:color w:val="000000"/>
           <w:sz w:val="24"/>
         </w:rPr>
-        <w:t>2.2 Common Pitfalls and Engagement Techniques</w:t>
+        <w:t>5.2 Common Pitfalls and Engagement Techniques</w:t>
       </w:r>
     </w:p>
     <w:p>
@@ -959,7 +1218,7 @@
           <w:color w:val="000000"/>
           <w:sz w:val="24"/>
         </w:rPr>
-        <w:t>3. ELICITATION TECHNIQUES AND FIELD REALITIES (THE AS IS STATE)</w:t>
+        <w:t>6. ELICITATION TECHNIQUES AND FIELD REALITIES (THE AS IS STATE)</w:t>
       </w:r>
     </w:p>
     <w:p>
@@ -973,7 +1232,7 @@
           <w:color w:val="000000"/>
           <w:sz w:val="24"/>
         </w:rPr>
-        <w:t>Given the single site visit, Group K used Direct Observation and Semi Structured Interviews. The following facts represent the current operational reality of the business.</w:t>
+        <w:t>Group K used Direct Observation and Semi Structured Interviews. The following facts represent the current operational reality of the business.</w:t>
       </w:r>
     </w:p>
     <w:p>
@@ -1057,6 +1316,29 @@
           <w:sz w:val="24"/>
         </w:rPr>
         <w:t>Security: The site has CCTV cameras, indicating a baseline awareness of physical security and cash handling risks.</w:t>
+      </w:r>
+    </w:p>
+    <w:p>
+      <w:pPr>
+        <w:spacing w:lineRule="auto" w:line="276" w:before="0" w:after="60"/>
+      </w:pPr>
+      <w:r>
+        <w:rPr>
+          <w:rFonts w:ascii="Times New Roman" w:hAnsi="Times New Roman" w:cs="Times New Roman" w:eastAsia="Times New Roman"/>
+          <w:b w:val="0"/>
+          <w:color w:val="000000"/>
+          <w:sz w:val="24"/>
+        </w:rPr>
+        <w:t xml:space="preserve">•  </w:t>
+      </w:r>
+      <w:r>
+        <w:rPr>
+          <w:rFonts w:ascii="Times New Roman" w:hAnsi="Times New Roman" w:cs="Times New Roman" w:eastAsia="Times New Roman"/>
+          <w:b w:val="0"/>
+          <w:color w:val="000000"/>
+          <w:sz w:val="24"/>
+        </w:rPr>
+        <w:t>Machinery: Production area has block making machinery (vibrators, moulds, mixers) observed on site.</w:t>
       </w:r>
     </w:p>
     <w:p>
@@ -1185,7 +1467,7 @@
           <w:color w:val="000000"/>
           <w:sz w:val="24"/>
         </w:rPr>
-        <w:t>Labor: There is no formal attendance system. Attendance relies entirely on the Sales Manager memory, and workers are paid daily in cash without legal contracts.</w:t>
+        <w:t>Labour: There is no formal attendance system. Attendance relies entirely on the Sales Manager memory, and workers are paid daily in cash without legal contracts.</w:t>
       </w:r>
     </w:p>
     <w:p>
@@ -1199,7 +1481,7 @@
           <w:color w:val="000000"/>
           <w:sz w:val="24"/>
         </w:rPr>
-        <w:t>4. CHALLENGES IN ELICITATION AND DOCUMENTED LIMITATIONS</w:t>
+        <w:t>7. CHALLENGES IN ELICITATION AND DOCUMENTED LIMITATIONS</w:t>
       </w:r>
     </w:p>
     <w:p>
@@ -1213,7 +1495,7 @@
           <w:color w:val="000000"/>
           <w:sz w:val="24"/>
         </w:rPr>
-        <w:t>As Group K, we faced the following empirical challenges, which are now locked as limitations for the project.</w:t>
+        <w:t>As Group K, we faced the following empirical challenges, which are documented as limitations for the project.</w:t>
       </w:r>
     </w:p>
     <w:p>
@@ -1305,7 +1587,7 @@
           <w:color w:val="000000"/>
           <w:sz w:val="24"/>
         </w:rPr>
-        <w:t>No Follow up Feasibility. The Sales Manager was unwilling to provide further information, and a return visit to the site is not possible. The project scope is locked.</w:t>
+        <w:t>Further follow up visits were not feasible. The Sales Manager was unwilling to provide further information, and a return visit to the site could not be arranged. The project scope is locked.</w:t>
       </w:r>
     </w:p>
     <w:p>
@@ -1319,7 +1601,7 @@
           <w:color w:val="000000"/>
           <w:sz w:val="24"/>
         </w:rPr>
-        <w:t>5. OPERATIONAL DEDUCTIONS AND SYSTEM SPECIFICATIONS</w:t>
+        <w:t>8. STRATEGIC BUSINESS SYNTHESIS</w:t>
       </w:r>
     </w:p>
     <w:p>
@@ -1333,7 +1615,7 @@
           <w:color w:val="000000"/>
           <w:sz w:val="24"/>
         </w:rPr>
-        <w:t>Because we cannot return to the site to close the gaps identified in Section 4, we must apply strategic business synthesis. These are logical inferences drawn from our verified facts combined with the standard operational norms of Ugandan construction SMEs. They serve as the baseline assumptions for the subsequent Requirements Analysis phase.</w:t>
+        <w:t>Because we cannot return to the site to close the gaps identified in Section 7, we apply strategic business synthesis. These are logical inferences drawn from verified facts combined with standard operational norms of Ugandan construction SMEs. They serve as baseline assumptions for the subsequent Requirements Analysis phase.</w:t>
       </w:r>
     </w:p>
     <w:p>
@@ -1417,7 +1699,7 @@
           <w:color w:val="000000"/>
           <w:sz w:val="24"/>
         </w:rPr>
-        <w:t>Fact: The laptop is on during the day, and physical receipts are printed for customers. However, the Sales Manager also heavily utilizes the PC right before the Business Owner arrives in the evening specifically to process cash deficits.</w:t>
+        <w:t>Fact: The laptop is on during the day, and physical receipts are printed for customers. However, the Sales Manager also heavily utilises the PC right before the Business Owner arrives in the evening specifically to process cash deficits.</w:t>
       </w:r>
     </w:p>
     <w:p>
@@ -1515,7 +1797,7 @@
           <w:color w:val="000000"/>
           <w:sz w:val="24"/>
         </w:rPr>
-        <w:t>Fact: The owner visits the site every day. No cloud backup currently exists.</w:t>
+        <w:t>Fact: The Owner visits the site every day. No cloud backup currently exists.</w:t>
       </w:r>
     </w:p>
     <w:p>
@@ -1529,7 +1811,7 @@
           <w:color w:val="000000"/>
           <w:sz w:val="24"/>
         </w:rPr>
-        <w:t>Synthesis: Because the owner is physically present daily, a real time remote monitoring dashboard is operationally redundant. The critical need for cloud technology is strictly for disaster recovery (protecting the single laptop from data loss) and asynchronous historical review.</w:t>
+        <w:t>Synthesis: Because the Owner is physically present daily, a real time remote monitoring dashboard is operationally redundant. The critical need for cloud technology is strictly for disaster recovery (protecting the single laptop from data loss) and asynchronous historical review.</w:t>
       </w:r>
     </w:p>
     <w:p>
@@ -1552,7 +1834,7 @@
           <w:color w:val="000000"/>
           <w:sz w:val="24"/>
         </w:rPr>
-        <w:t>The cloud feature is specified strictly as an Automated Nightly Backup, triggered in the evening after the final reconciliation is complete, to solve the Data Vulnerability problem of relying on a single laptop. The remote portal for the owner is an Asynchronous Dashboard for reviewing next day finalized reports and long term business trends, rather than a live monitoring tool.</w:t>
+        <w:t>The cloud feature is specified strictly as an Automated Nightly Backup, triggered in the evening after the final reconciliation is complete, to solve the Data Vulnerability problem of relying on a single laptop. The remote portal for the Owner is an Asynchronous Dashboard for reviewing next day finalised reports and long term business trends, rather than a live monitoring tool.</w:t>
       </w:r>
     </w:p>
     <w:p>
@@ -1566,7 +1848,7 @@
           <w:color w:val="000000"/>
           <w:sz w:val="24"/>
         </w:rPr>
-        <w:t>6. CONCLUSION AND TRANSITION</w:t>
+        <w:t>9. CONCLUSION AND TRANSITION</w:t>
       </w:r>
     </w:p>
     <w:p>

</xml_diff>

<commit_message>
docs: update Document 1 with corrected intro and punctuation
- Intro starts with 'Because further follow-up visits were not feasible...'
- Business Context: colon replaced with comma after 'centralised'
- All mid-sentence colons and semicolons removed
- Commas used for lists instead
</commit_message>
<xml_diff>
--- a/project_deliverables/Phase1_Elicitation-and-Stakeholder-Analysis.docx
+++ b/project_deliverables/Phase1_Elicitation-and-Stakeholder-Analysis.docx
@@ -108,7 +108,7 @@
           <w:color w:val="000000"/>
           <w:sz w:val="24"/>
         </w:rPr>
-        <w:t>This document outlines the Requirements Elicitation and Stakeholder Analysis conducted for the Deniz Construction Management System (DCMS). It details the data we gathered, the challenges faced during data collection, and the current operational reality of the business. Further follow up visits were not feasible and the Sales Manager was unwilling to provide further information. This document establishes the baseline for how unresolvable information gaps are handled through documented business assumptions based on the Ugandan SME context.</w:t>
+        <w:t>Because further follow up visits were not feasible and the Sales Manager was unwilling to provide further information, this document establishes the baseline for how unresolvable information gaps are handled through documented business assumptions based on the Ugandan SME context.</w:t>
       </w:r>
     </w:p>
     <w:p>
@@ -136,7 +136,7 @@
           <w:color w:val="000000"/>
           <w:sz w:val="24"/>
         </w:rPr>
-        <w:t>Deniz Construction Limited is a small construction materials business located on Ishanyu Bushenyi Road, Mbarara, Uganda. The business produces and sells concrete blocks, pavers, and kerbs. Operations are highly centralised: a single Sales Manager acts as supervisor, cashier, payroll distributor, record keeper, and tax filer. The Business Owner visits the site daily to review operations and cash. The business operates on a strict no credit policy with three payment channels: Cash, Mobile Money, and Bank Deposit. Physical receipts are printed on site for customers during truck loading. URA tax filing is done online. No cloud backup exists. Records are kept on a single laptop and in physical books. Workers are paid daily in cash without formal contracts.</w:t>
+        <w:t>Deniz Construction Limited is a small construction materials business located on Ishanyu Bushenyi Road, Mbarara, Uganda. The business produces and sells concrete blocks, pavers and kerbs. Operations are highly centralised, a single Sales Manager acts as supervisor, cashier, payroll distributor, record keeper and tax filer. The Business Owner visits the site daily to review operations and cash. The business operates on a strict no credit policy with three payment channels: Cash, Mobile Money and Bank Deposit. Physical receipts are printed on site for customers during truck loading. URA tax filing is done online. No cloud backup exists. Records are kept on a single laptop and in physical books. Workers are paid daily in cash without formal contracts.</w:t>
       </w:r>
     </w:p>
     <w:p>
@@ -187,7 +187,7 @@
           <w:color w:val="000000"/>
           <w:sz w:val="24"/>
         </w:rPr>
-        <w:t>Super Manager Bottleneck: One person absorbs supervision, sales, payroll, record keeping, and tax filing a single point of failure.</w:t>
+        <w:t>Super Manager Bottleneck: One person absorbs supervision, sales, payroll, record keeping and tax filing a single point of failure.</w:t>
       </w:r>
     </w:p>
     <w:p>
@@ -210,7 +210,7 @@
           <w:color w:val="000000"/>
           <w:sz w:val="24"/>
         </w:rPr>
-        <w:t>Unexplained Cash Deficits: End of day cash shortages are manually computed without a tool to log operational expenses (e.g., loader lunch, transport), making variance causes opaque.</w:t>
+        <w:t>Unexplained Cash Deficits: End of day cash shortages are manually computed without a tool to log operational expenses (e.g. Loader lunch, transport), making variance causes opaque.</w:t>
       </w:r>
     </w:p>
     <w:p>
@@ -367,7 +367,7 @@
           <w:color w:val="000000"/>
           <w:sz w:val="24"/>
         </w:rPr>
-        <w:t>The system runs on the existing laptop, operates offline first during the day, and performs an automated nightly cloud backup after evening reconciliation for disaster recovery.</w:t>
+        <w:t>The system runs on the existing laptop, operates offline first during the day and performs an automated nightly cloud backup after evening reconciliation for disaster recovery.</w:t>
       </w:r>
     </w:p>
     <w:p>
@@ -667,7 +667,7 @@
                 <w:color w:val="000000"/>
                 <w:sz w:val="24"/>
               </w:rPr>
-              <w:t>The absolute centre of operations. Acts as supervisor, cashier, payroll distributor, and record keeper.</w:t>
+              <w:t>The absolute centre of operations. Acts as supervisor, cashier, payroll distributor and record keeper.</w:t>
             </w:r>
           </w:p>
         </w:tc>
@@ -1204,7 +1204,7 @@
           <w:color w:val="000000"/>
           <w:sz w:val="24"/>
         </w:rPr>
-        <w:t>We used observation over direct interrogation for sensitive topics. By observing the physical environment, for example, the CCTV cameras, the printer, and the laptop usage timing, we inferred security and workflow realities without making her defensive.</w:t>
+        <w:t>We used observation over direct interrogation for sensitive topics. By observing the physical environment, for example, the CCTV cameras, the printer and the laptop usage timing, we inferred security and workflow realities without making her defensive.</w:t>
       </w:r>
     </w:p>
     <w:p>
@@ -1269,7 +1269,7 @@
           <w:color w:val="000000"/>
           <w:sz w:val="24"/>
         </w:rPr>
-        <w:t>Workflow and Hardware: The laptop was powered on and actively used during the day. A printer is on site, and physical receipts were being printed for customers as trucks loaded.</w:t>
+        <w:t>Workflow and Hardware: The laptop was powered on and actively used during the day. A printer is on site and physical receipts were being printed for customers as trucks loaded.</w:t>
       </w:r>
     </w:p>
     <w:p>
@@ -1375,7 +1375,7 @@
           <w:color w:val="000000"/>
           <w:sz w:val="24"/>
         </w:rPr>
-        <w:t>Payment Channels: The business accepts Cash, Mobile Money, and direct Bank Deposits.</w:t>
+        <w:t>Payment Channels: The business accepts Cash, Mobile Money and direct Bank Deposits.</w:t>
       </w:r>
     </w:p>
     <w:p>
@@ -1467,7 +1467,7 @@
           <w:color w:val="000000"/>
           <w:sz w:val="24"/>
         </w:rPr>
-        <w:t>Labour: There is no formal attendance system. Attendance relies entirely on the Sales Manager memory, and workers are paid daily in cash without legal contracts.</w:t>
+        <w:t>Labour: There is no formal attendance system. Attendance relies entirely on the Sales Manager memory and workers are paid daily in cash without legal contracts.</w:t>
       </w:r>
     </w:p>
     <w:p>
@@ -1518,7 +1518,7 @@
           <w:color w:val="000000"/>
           <w:sz w:val="24"/>
         </w:rPr>
-        <w:t>Stakeholder Hesitance and Information Withholding. The Sales Manager was reluctant to disclose the exact fields on the physical receipts, the method used to calculate URA taxes, and the physical cash storage protocols.</w:t>
+        <w:t>Stakeholder Hesitance and Information Withholding. The Sales Manager was reluctant to disclose the exact fields on the physical receipts, the method used to calculate URA taxes and the physical cash storage protocols.</w:t>
       </w:r>
     </w:p>
     <w:p>
@@ -1541,7 +1541,7 @@
           <w:color w:val="000000"/>
           <w:sz w:val="24"/>
         </w:rPr>
-        <w:t>Inaccessibility of Secondary Stakeholders. The Business Owner was not available for interview, and the Site Workers and Secretary could not be approached directly.</w:t>
+        <w:t>Inaccessibility of Secondary Stakeholders. The Business Owner was not available for interview and the Site Workers and Secretary could not be approached directly.</w:t>
       </w:r>
     </w:p>
     <w:p>
@@ -1587,7 +1587,7 @@
           <w:color w:val="000000"/>
           <w:sz w:val="24"/>
         </w:rPr>
-        <w:t>Further follow up visits were not feasible. The Sales Manager was unwilling to provide further information, and a return visit to the site could not be arranged. The project scope is locked.</w:t>
+        <w:t>Further follow up visits were not feasible. The Sales Manager was unwilling to provide further information and a return visit to the site could not be arranged. The project scope is locked.</w:t>
       </w:r>
     </w:p>
     <w:p>
@@ -1699,7 +1699,7 @@
           <w:color w:val="000000"/>
           <w:sz w:val="24"/>
         </w:rPr>
-        <w:t>Fact: The laptop is on during the day, and physical receipts are printed for customers. However, the Sales Manager also heavily utilises the PC right before the Business Owner arrives in the evening specifically to process cash deficits.</w:t>
+        <w:t>Fact: The laptop is on during the day and physical receipts are printed for customers. However, the Sales Manager also heavily utilises the PC right before the Business Owner arrives in the evening specifically to process cash deficits.</w:t>
       </w:r>
     </w:p>
     <w:p>
@@ -1755,7 +1755,7 @@
           <w:color w:val="000000"/>
           <w:sz w:val="24"/>
         </w:rPr>
-        <w:t>Fact: Physical receipts are printed on site, and trucks load in bulk. Exact receipt fields are unknown.</w:t>
+        <w:t>Fact: Physical receipts are printed on site and trucks load in bulk. Exact receipt fields are unknown.</w:t>
       </w:r>
     </w:p>
     <w:p>

</xml_diff>